<commit_message>
Big update to both POPvJPvCauchy and to S1 analysis pipeline.
- update for the first week of Sept
- S1 small-N1 analysis seems ok using bayesian generative modelling
- POPvJPvCauchy need more work and learning, but initial fitting is done
- added gitignore so large fitting results are local
</commit_message>
<xml_diff>
--- a/Data/Encoding 2025-26/Encoding Study Draft.docx
+++ b/Data/Encoding 2025-26/Encoding Study Draft.docx
@@ -4622,7 +4622,7 @@
           <w:lang w:eastAsia="zh-CN"/>
         </w:rPr>
         <w:drawing>
-          <wp:inline distT="0" distB="0" distL="0" distR="0" wp14:anchorId="7B3444FF" wp14:editId="557086D8">
+          <wp:inline distT="0" distB="0" distL="0" distR="0" wp14:anchorId="7B3444FF" wp14:editId="41195DBC">
             <wp:extent cx="6600901" cy="3285641"/>
             <wp:effectExtent l="0" t="0" r="3175" b="3810"/>
             <wp:docPr id="1207469906" name="Picture 1"/>
@@ -4747,7 +4747,7 @@
         </w:rPr>
         <w:lastRenderedPageBreak/>
         <w:drawing>
-          <wp:inline distT="0" distB="0" distL="0" distR="0" wp14:anchorId="46073AE9" wp14:editId="040BD82A">
+          <wp:inline distT="0" distB="0" distL="0" distR="0" wp14:anchorId="46073AE9" wp14:editId="6B6C9EEA">
             <wp:extent cx="6844990" cy="3417376"/>
             <wp:effectExtent l="0" t="0" r="635" b="0"/>
             <wp:docPr id="1726349811" name="Picture 2"/>
@@ -4881,7 +4881,7 @@
           <w:lang w:eastAsia="zh-CN"/>
         </w:rPr>
         <w:drawing>
-          <wp:anchor distT="0" distB="0" distL="114300" distR="114300" simplePos="0" relativeHeight="251659264" behindDoc="1" locked="0" layoutInCell="1" allowOverlap="1" wp14:anchorId="7A7550BA" wp14:editId="3ABD1CEF">
+          <wp:anchor distT="0" distB="0" distL="114300" distR="114300" simplePos="0" relativeHeight="251659264" behindDoc="1" locked="0" layoutInCell="1" allowOverlap="1" wp14:anchorId="7A7550BA" wp14:editId="10857881">
             <wp:simplePos x="0" y="0"/>
             <wp:positionH relativeFrom="column">
               <wp:posOffset>0</wp:posOffset>
@@ -5011,7 +5011,7 @@
           <w:lang w:eastAsia="zh-CN"/>
         </w:rPr>
         <w:drawing>
-          <wp:anchor distT="0" distB="0" distL="114300" distR="114300" simplePos="0" relativeHeight="251660288" behindDoc="1" locked="0" layoutInCell="1" allowOverlap="1" wp14:anchorId="1A1BCED6" wp14:editId="75D65663">
+          <wp:anchor distT="0" distB="0" distL="114300" distR="114300" simplePos="0" relativeHeight="251660288" behindDoc="1" locked="0" layoutInCell="1" allowOverlap="1" wp14:anchorId="1A1BCED6" wp14:editId="27AF70C2">
             <wp:simplePos x="0" y="0"/>
             <wp:positionH relativeFrom="column">
               <wp:posOffset>1166</wp:posOffset>
@@ -5110,7 +5110,7 @@
           <w:lang w:eastAsia="zh-CN"/>
         </w:rPr>
         <w:drawing>
-          <wp:anchor distT="0" distB="0" distL="114300" distR="114300" simplePos="0" relativeHeight="251661312" behindDoc="1" locked="0" layoutInCell="1" allowOverlap="1" wp14:anchorId="211D9A58" wp14:editId="0D4D9EEB">
+          <wp:anchor distT="0" distB="0" distL="114300" distR="114300" simplePos="0" relativeHeight="251661312" behindDoc="1" locked="0" layoutInCell="1" allowOverlap="1" wp14:anchorId="211D9A58" wp14:editId="19FA0571">
             <wp:simplePos x="0" y="0"/>
             <wp:positionH relativeFrom="column">
               <wp:posOffset>-531</wp:posOffset>
@@ -8555,7 +8555,6 @@
       <w:pPr>
         <w:ind w:firstLine="0"/>
         <w:rPr>
-          <w:rFonts w:hint="eastAsia"/>
           <w:lang w:eastAsia="zh-CN"/>
         </w:rPr>
       </w:pPr>
@@ -9306,16 +9305,7 @@
                 <w:szCs w:val="20"/>
                 <w:lang w:val="en-AU" w:eastAsia="zh-CN"/>
               </w:rPr>
-              <w:t>0</w:t>
-            </w:r>
-            <w:r>
-              <w:rPr>
-                <w:rFonts w:eastAsia="Times New Roman"/>
-                <w:sz w:val="20"/>
-                <w:szCs w:val="20"/>
-                <w:lang w:val="en-AU" w:eastAsia="zh-CN"/>
-              </w:rPr>
-              <w:t>.08</w:t>
+              <w:t>0.08</w:t>
             </w:r>
           </w:p>
         </w:tc>
@@ -12831,10 +12821,14 @@
       <w:r>
         <w:rPr>
           <w:noProof/>
-          <w:color w:val="000000" w:themeColor="text1"/>
-        </w:rPr>
-        <w:pict w14:anchorId="6C3320D6">
-          <v:rect id="_x0000_i1027" style="width:0;height:1.5pt" o:hralign="center" o:hrstd="t" o:hr="t" fillcolor="#a0a0a0" stroked="f"/>
+        </w:rPr>
+      </w:r>
+      <w:r>
+        <w:pict w14:anchorId="72C05A9F">
+          <v:rect id="Horizontal Line 1" o:spid="_x0000_s2052" style="width:468pt;height:1.1pt;visibility:visible;mso-wrap-style:square;mso-left-percent:-10001;mso-top-percent:-10001;mso-position-horizontal:absolute;mso-position-horizontal-relative:char;mso-position-vertical:absolute;mso-position-vertical-relative:line;mso-left-percent:-10001;mso-top-percent:-10001;v-text-anchor:top" o:gfxdata="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" filled="f">
+            <o:lock v:ext="edit" rotation="t" aspectratio="t" verticies="t" text="t" shapetype="t"/>
+            <w10:anchorlock/>
+          </v:rect>
         </w:pict>
       </w:r>
     </w:p>
@@ -13290,10 +13284,14 @@
       <w:r>
         <w:rPr>
           <w:noProof/>
-          <w:color w:val="000000" w:themeColor="text1"/>
-        </w:rPr>
-        <w:pict w14:anchorId="7FA2FBD0">
-          <v:rect id="_x0000_i1026" alt="" style="width:451.3pt;height:.05pt;mso-width-percent:0;mso-height-percent:0;mso-width-percent:0;mso-height-percent:0" o:hralign="center" o:hrstd="t" o:hr="t" fillcolor="#a0a0a0" stroked="f"/>
+        </w:rPr>
+      </w:r>
+      <w:r>
+        <w:pict w14:anchorId="284F9764">
+          <v:rect id="Horizontal Line 2" o:spid="_x0000_s2051" style="width:468pt;height:.05pt;visibility:visible;mso-wrap-style:square;mso-left-percent:-10001;mso-top-percent:-10001;mso-position-horizontal:absolute;mso-position-horizontal-relative:char;mso-position-vertical:absolute;mso-position-vertical-relative:line;mso-left-percent:-10001;mso-top-percent:-10001;v-text-anchor:top" o:gfxdata="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" filled="f">
+            <o:lock v:ext="edit" rotation="t" aspectratio="t" verticies="t" text="t" shapetype="t"/>
+            <w10:anchorlock/>
+          </v:rect>
         </w:pict>
       </w:r>
     </w:p>
@@ -13480,10 +13478,14 @@
       <w:r>
         <w:rPr>
           <w:noProof/>
-          <w:color w:val="000000" w:themeColor="text1"/>
-        </w:rPr>
-        <w:pict w14:anchorId="7BD990EC">
-          <v:rect id="_x0000_i1025" style="width:0;height:1.5pt" o:hralign="center" o:hrstd="t" o:hr="t" fillcolor="#a0a0a0" stroked="f"/>
+        </w:rPr>
+      </w:r>
+      <w:r>
+        <w:pict w14:anchorId="7CE83920">
+          <v:rect id="Horizontal Line 3" o:spid="_x0000_s2050" style="width:468pt;height:1.1pt;visibility:visible;mso-wrap-style:square;mso-left-percent:-10001;mso-top-percent:-10001;mso-position-horizontal:absolute;mso-position-horizontal-relative:char;mso-position-vertical:absolute;mso-position-vertical-relative:line;mso-left-percent:-10001;mso-top-percent:-10001;v-text-anchor:top" o:gfxdata="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" filled="f">
+            <o:lock v:ext="edit" rotation="t" aspectratio="t" verticies="t" text="t" shapetype="t"/>
+            <w10:anchorlock/>
+          </v:rect>
         </w:pict>
       </w:r>
     </w:p>
@@ -13596,10 +13598,29 @@
       <w:pPr>
         <w:ind w:firstLine="0"/>
         <w:rPr>
-          <w:rFonts w:hint="eastAsia"/>
-          <w:lang w:eastAsia="zh-CN"/>
-        </w:rPr>
-      </w:pPr>
+          <w:lang w:eastAsia="zh-CN"/>
+        </w:rPr>
+      </w:pPr>
+    </w:p>
+    <w:p>
+      <w:pPr>
+        <w:ind w:firstLine="0"/>
+        <w:rPr>
+          <w:lang w:eastAsia="zh-CN"/>
+        </w:rPr>
+      </w:pPr>
+      <w:r>
+        <w:rPr>
+          <w:lang w:eastAsia="zh-CN"/>
+        </w:rPr>
+        <w:t xml:space="preserve">*** If this is encoding, it points to encoding of color not a hard and shared </w:t>
+      </w:r>
+      <w:r>
+        <w:rPr>
+          <w:lang w:eastAsia="zh-CN"/>
+        </w:rPr>
+        <w:t>manner of processing across people. Expertise, practice, simple vs varied array context may all implicate encoding rate account.</w:t>
+      </w:r>
     </w:p>
     <w:p>
       <w:pPr>

</xml_diff>